<commit_message>
style(assessment): rename 'For Official Use Only' to 'Grading' and move it onto page 2
- The grading block (competency statement + Grade C/NYC + assessor name/NRIC/date/
  signature) now sits on page 2 directly after the Instructions, and is removed from
  the end of the paper; drop the stray underline rule
- Applied in the wsq-assessment build_assessment.py skill (project + user level);
  regenerate the v5 DOCX (WA now 6 pages, questions still start on page 3)

Co-Authored-By: Claude Opus 4.8 (1M context) <noreply@anthropic.com>
</commit_message>
<xml_diff>
--- a/assessment/PP Assessment - Agentic AI Automation with n8n - v5.docx
+++ b/assessment/PP Assessment - Agentic AI Automation with n8n - v5.docx
@@ -449,6 +449,72 @@
       </w:r>
     </w:p>
     <w:p>
+      <w:pPr>
+        <w:spacing w:after="120" w:before="160"/>
+      </w:pPr>
+      <w:r>
+        <w:rPr>
+          <w:b/>
+          <w:i w:val="0"/>
+          <w:color w:val="1F6FEB"/>
+          <w:sz w:val="26"/>
+        </w:rPr>
+        <w:t>Grading</w:t>
+      </w:r>
+    </w:p>
+    <w:p>
+      <w:pPr>
+        <w:spacing w:after="160" w:before="0"/>
+      </w:pPr>
+      <w:r>
+        <w:rPr>
+          <w:b w:val="0"/>
+          <w:i w:val="0"/>
+          <w:sz w:val="22"/>
+        </w:rPr>
+        <w:t>Candidate has successfully completed all PP tasks and can explain the overall functions and features used to achieve them.</w:t>
+      </w:r>
+    </w:p>
+    <w:p>
+      <w:pPr>
+        <w:spacing w:after="80" w:before="0"/>
+      </w:pPr>
+      <w:r>
+        <w:rPr>
+          <w:b w:val="0"/>
+          <w:i w:val="0"/>
+          <w:sz w:val="22"/>
+        </w:rPr>
+        <w:t>Grade: _______  (C / NYC)</w:t>
+      </w:r>
+    </w:p>
+    <w:p>
+      <w:pPr>
+        <w:spacing w:after="80" w:before="0"/>
+      </w:pPr>
+      <w:r>
+        <w:rPr>
+          <w:b w:val="0"/>
+          <w:i w:val="0"/>
+          <w:sz w:val="22"/>
+        </w:rPr>
+        <w:t>Assessor Name: __________________________   Assessor NRIC: ________________</w:t>
+      </w:r>
+    </w:p>
+    <w:p>
+      <w:pPr>
+        <w:spacing w:after="80" w:before="0"/>
+      </w:pPr>
+      <w:r>
+        <w:rPr>
+          <w:b w:val="0"/>
+          <w:i w:val="0"/>
+          <w:sz w:val="22"/>
+        </w:rPr>
+        <w:t>Date: ________________________                    Signature: ____________________</w:t>
+      </w:r>
+    </w:p>
+    <w:p>
       <w:r>
         <w:br w:type="page"/>
       </w:r>
@@ -838,87 +904,6 @@
         <w:spacing w:after="40"/>
       </w:pPr>
     </w:p>
-    <w:p/>
-    <w:p>
-      <w:pPr>
-        <w:spacing w:after="80" w:before="0"/>
-      </w:pPr>
-      <w:r>
-        <w:rPr>
-          <w:b w:val="0"/>
-          <w:i w:val="0"/>
-          <w:color w:val="555B66"/>
-          <w:sz w:val="22"/>
-        </w:rPr>
-        <w:t>______________________________________________________________________________</w:t>
-      </w:r>
-    </w:p>
-    <w:p>
-      <w:pPr>
-        <w:spacing w:after="120" w:before="160"/>
-      </w:pPr>
-      <w:r>
-        <w:rPr>
-          <w:b/>
-          <w:i w:val="0"/>
-          <w:color w:val="1F6FEB"/>
-          <w:sz w:val="26"/>
-        </w:rPr>
-        <w:t>For Official Use Only</w:t>
-      </w:r>
-    </w:p>
-    <w:p>
-      <w:pPr>
-        <w:spacing w:after="160" w:before="0"/>
-      </w:pPr>
-      <w:r>
-        <w:rPr>
-          <w:b w:val="0"/>
-          <w:i w:val="0"/>
-          <w:sz w:val="22"/>
-        </w:rPr>
-        <w:t>Candidate has successfully completed all PP tasks and can explain the overall functions and features used to achieve them.</w:t>
-      </w:r>
-    </w:p>
-    <w:p>
-      <w:pPr>
-        <w:spacing w:after="80" w:before="0"/>
-      </w:pPr>
-      <w:r>
-        <w:rPr>
-          <w:b w:val="0"/>
-          <w:i w:val="0"/>
-          <w:sz w:val="22"/>
-        </w:rPr>
-        <w:t>Grade: _______  (C / NYC)</w:t>
-      </w:r>
-    </w:p>
-    <w:p>
-      <w:pPr>
-        <w:spacing w:after="80" w:before="0"/>
-      </w:pPr>
-      <w:r>
-        <w:rPr>
-          <w:b w:val="0"/>
-          <w:i w:val="0"/>
-          <w:sz w:val="22"/>
-        </w:rPr>
-        <w:t>Assessor Name: __________________________   Assessor NRIC: ________________</w:t>
-      </w:r>
-    </w:p>
-    <w:p>
-      <w:pPr>
-        <w:spacing w:after="80" w:before="0"/>
-      </w:pPr>
-      <w:r>
-        <w:rPr>
-          <w:b w:val="0"/>
-          <w:i w:val="0"/>
-          <w:sz w:val="22"/>
-        </w:rPr>
-        <w:t>Date: ________________________                    Signature: ____________________</w:t>
-      </w:r>
-    </w:p>
     <w:sectPr>
       <w:footerReference w:type="default" r:id="rId11"/>
       <w:pgSz w:w="12240" w:h="15840"/>

</xml_diff>

<commit_message>
style(assessment): double-spaced fill-in fields (Trainee info + signature), front matter kept to one page
- Trainee Information and Grading/assessor fields now use double line spacing so
  learners/assessors have more room to write, using the page height
- Tuned spacing so the whole front matter (Trainee Info + Instructions + Grading)
  still fits on a single page; questions/tasks start on page 3
- Applied in the wsq-assessment build_assessment.py skill (project + user level)

Co-Authored-By: Claude Opus 4.8 (1M context) <noreply@anthropic.com>
</commit_message>
<xml_diff>
--- a/assessment/PP Assessment - Agentic AI Automation with n8n - v5.docx
+++ b/assessment/PP Assessment - Agentic AI Automation with n8n - v5.docx
@@ -287,7 +287,7 @@
     </w:p>
     <w:p>
       <w:pPr>
-        <w:spacing w:after="120" w:before="0"/>
+        <w:spacing w:after="120" w:before="0" w:line="480" w:lineRule="auto"/>
       </w:pPr>
       <w:r>
         <w:rPr>
@@ -300,7 +300,7 @@
     </w:p>
     <w:p>
       <w:pPr>
-        <w:spacing w:after="120" w:before="0"/>
+        <w:spacing w:after="120" w:before="0" w:line="480" w:lineRule="auto"/>
       </w:pPr>
       <w:r>
         <w:rPr>
@@ -313,7 +313,7 @@
     </w:p>
     <w:p>
       <w:pPr>
-        <w:spacing w:after="120" w:before="0"/>
+        <w:spacing w:after="120" w:before="0" w:line="480" w:lineRule="auto"/>
       </w:pPr>
       <w:r>
         <w:rPr>
@@ -464,7 +464,7 @@
     </w:p>
     <w:p>
       <w:pPr>
-        <w:spacing w:after="160" w:before="0"/>
+        <w:spacing w:after="240" w:before="0"/>
       </w:pPr>
       <w:r>
         <w:rPr>
@@ -477,7 +477,7 @@
     </w:p>
     <w:p>
       <w:pPr>
-        <w:spacing w:after="80" w:before="0"/>
+        <w:spacing w:after="120" w:before="0" w:line="480" w:lineRule="auto"/>
       </w:pPr>
       <w:r>
         <w:rPr>
@@ -490,7 +490,7 @@
     </w:p>
     <w:p>
       <w:pPr>
-        <w:spacing w:after="80" w:before="0"/>
+        <w:spacing w:after="120" w:before="0" w:line="480" w:lineRule="auto"/>
       </w:pPr>
       <w:r>
         <w:rPr>
@@ -503,7 +503,7 @@
     </w:p>
     <w:p>
       <w:pPr>
-        <w:spacing w:after="80" w:before="0"/>
+        <w:spacing w:after="120" w:before="0" w:line="480" w:lineRule="auto"/>
       </w:pPr>
       <w:r>
         <w:rPr>

</xml_diff>